<commit_message>
chore: upload project data excluding node_modules
</commit_message>
<xml_diff>
--- a/VEE_AGENCY_DESIGN_DOCUMENTATION.docx
+++ b/VEE_AGENCY_DESIGN_DOCUMENTATION.docx
@@ -54,29 +54,29 @@
           <w:sz w:val="24"/>
           <w:sz-cs w:val="24"/>
         </w:rPr>
-        <w:t xml:space="preserve">VEE Agency is designed as a calm, practical financial workspace where clarity matters more than visual noise. The interface is intentionally structured to support frequent, repetitive business tasks such as tracking bills, checking balances, creating statements, and reviewing spending. Instead of trying to look decorative, the product design emphasizes confidence, readability, and operational speed.</w:t>
-      </w:r>
-    </w:p>
-    <w:p>
-      <w:pPr/>
-      <w:r>
-        <w:rPr>
-          <w:rFonts w:ascii="Helvetica Light" w:hAnsi="Helvetica Light" w:cs="Helvetica Light"/>
-          <w:sz w:val="24"/>
-          <w:sz-cs w:val="24"/>
-        </w:rPr>
-        <w:t xml:space="preserve"/>
-      </w:r>
-    </w:p>
-    <w:p>
-      <w:pPr/>
-      <w:r>
-        <w:rPr>
-          <w:rFonts w:ascii="Helvetica Light" w:hAnsi="Helvetica Light" w:cs="Helvetica Light"/>
-          <w:sz w:val="24"/>
-          <w:sz-cs w:val="24"/>
-        </w:rPr>
-        <w:t xml:space="preserve">At a high level, the design combines two complementary personalities:</w:t>
+        <w:t xml:space="preserve">VEE Agency is designed as a calm, practical financial workspace where clarity matters more than visual noise. The interface is intentionally structured to support frequent, repetitive business tasks such as tracking bills, checking balances, recording payments, generating statements, and reviewing spending. Instead of trying to look decorative, the product design emphasizes confidence, readability, and operational speed.</w:t>
+      </w:r>
+    </w:p>
+    <w:p>
+      <w:pPr/>
+      <w:r>
+        <w:rPr>
+          <w:rFonts w:ascii="Helvetica Light" w:hAnsi="Helvetica Light" w:cs="Helvetica Light"/>
+          <w:sz w:val="24"/>
+          <w:sz-cs w:val="24"/>
+        </w:rPr>
+        <w:t xml:space="preserve"/>
+      </w:r>
+    </w:p>
+    <w:p>
+      <w:pPr/>
+      <w:r>
+        <w:rPr>
+          <w:rFonts w:ascii="Helvetica Light" w:hAnsi="Helvetica Light" w:cs="Helvetica Light"/>
+          <w:sz w:val="24"/>
+          <w:sz-cs w:val="24"/>
+        </w:rPr>
+        <w:t xml:space="preserve">At a high level, the design combines three complementary personalities:</w:t>
       </w:r>
     </w:p>
     <w:p>
@@ -120,18 +120,29 @@
           <w:sz w:val="24"/>
           <w:sz-cs w:val="24"/>
         </w:rPr>
-        <w:t xml:space="preserve"/>
-      </w:r>
-    </w:p>
-    <w:p>
-      <w:pPr/>
-      <w:r>
-        <w:rPr>
-          <w:rFonts w:ascii="Helvetica Light" w:hAnsi="Helvetica Light" w:cs="Helvetica Light"/>
-          <w:sz w:val="24"/>
-          <w:sz-cs w:val="24"/>
-        </w:rPr>
-        <w:t xml:space="preserve">This dual character is one of the strongest design outcomes in the project. On screen, users get lightweight cards, compact tables, and direct actions. On paper, they get structured, high-contrast, professional statement layouts with clear accounting semantics.</w:t>
+        <w:t xml:space="preserve">3. Mobile-first quick-navigation design for fast, repeat actions on Android.</w:t>
+      </w:r>
+    </w:p>
+    <w:p>
+      <w:pPr/>
+      <w:r>
+        <w:rPr>
+          <w:rFonts w:ascii="Helvetica Light" w:hAnsi="Helvetica Light" w:cs="Helvetica Light"/>
+          <w:sz w:val="24"/>
+          <w:sz-cs w:val="24"/>
+        </w:rPr>
+        <w:t xml:space="preserve"/>
+      </w:r>
+    </w:p>
+    <w:p>
+      <w:pPr/>
+      <w:r>
+        <w:rPr>
+          <w:rFonts w:ascii="Helvetica Light" w:hAnsi="Helvetica Light" w:cs="Helvetica Light"/>
+          <w:sz w:val="24"/>
+          <w:sz-cs w:val="24"/>
+        </w:rPr>
+        <w:t xml:space="preserve">This multi-mode character is one of the strongest design outcomes in the project. On screen, users get lightweight cards, compact tables, and direct actions. On mobile, they get icon-first quick navigation and thumb-friendly targets. On paper, they get structured, high-contrast, professional statement layouts with clear accounting semantics.</w:t>
       </w:r>
     </w:p>
     <w:p>
@@ -1297,6 +1308,28 @@
           <w:sz w:val="24"/>
           <w:sz-cs w:val="24"/>
         </w:rPr>
+        <w:t xml:space="preserve">5. Desktop quick-nav keeps high-frequency destinations one click away.</w:t>
+      </w:r>
+    </w:p>
+    <w:p>
+      <w:pPr/>
+      <w:r>
+        <w:rPr>
+          <w:rFonts w:ascii="Helvetica Light" w:hAnsi="Helvetica Light" w:cs="Helvetica Light"/>
+          <w:sz w:val="24"/>
+          <w:sz-cs w:val="24"/>
+        </w:rPr>
+        <w:t xml:space="preserve">6. Mobile bottom quick-nav keeps high-frequency destinations one tap away.</w:t>
+      </w:r>
+    </w:p>
+    <w:p>
+      <w:pPr/>
+      <w:r>
+        <w:rPr>
+          <w:rFonts w:ascii="Helvetica Light" w:hAnsi="Helvetica Light" w:cs="Helvetica Light"/>
+          <w:sz w:val="24"/>
+          <w:sz-cs w:val="24"/>
+        </w:rPr>
         <w:t xml:space="preserve"/>
       </w:r>
     </w:p>
@@ -1462,6 +1495,17 @@
           <w:sz w:val="24"/>
           <w:sz-cs w:val="24"/>
         </w:rPr>
+        <w:t xml:space="preserve">4. Persistent bottom quick-nav for repeated daily loops.</w:t>
+      </w:r>
+    </w:p>
+    <w:p>
+      <w:pPr/>
+      <w:r>
+        <w:rPr>
+          <w:rFonts w:ascii="Helvetica Light" w:hAnsi="Helvetica Light" w:cs="Helvetica Light"/>
+          <w:sz w:val="24"/>
+          <w:sz-cs w:val="24"/>
+        </w:rPr>
         <w:t xml:space="preserve"/>
       </w:r>
     </w:p>
@@ -4147,6 +4191,1042 @@
           <w:sz-cs w:val="24"/>
         </w:rPr>
         <w:t xml:space="preserve">As a design system, the project is already solid and production-friendly. With small refinements, it can become an exemplary model of practical financial UI design for both screen and document workflows.</w:t>
+      </w:r>
+    </w:p>
+    <w:p>
+      <w:pPr/>
+      <w:r>
+        <w:rPr>
+          <w:rFonts w:ascii="Helvetica Light" w:hAnsi="Helvetica Light" w:cs="Helvetica Light"/>
+          <w:sz w:val="24"/>
+          <w:sz-cs w:val="24"/>
+        </w:rPr>
+        <w:t xml:space="preserve"/>
+      </w:r>
+    </w:p>
+    <w:p>
+      <w:pPr/>
+      <w:r>
+        <w:rPr>
+          <w:rFonts w:ascii="Helvetica Light" w:hAnsi="Helvetica Light" w:cs="Helvetica Light"/>
+          <w:sz w:val="24"/>
+          <w:sz-cs w:val="24"/>
+        </w:rPr>
+        <w:t xml:space="preserve">---</w:t>
+      </w:r>
+    </w:p>
+    <w:p>
+      <w:pPr/>
+      <w:r>
+        <w:rPr>
+          <w:rFonts w:ascii="Helvetica Light" w:hAnsi="Helvetica Light" w:cs="Helvetica Light"/>
+          <w:sz w:val="24"/>
+          <w:sz-cs w:val="24"/>
+        </w:rPr>
+        <w:t xml:space="preserve"/>
+      </w:r>
+    </w:p>
+    <w:p>
+      <w:pPr/>
+      <w:r>
+        <w:rPr>
+          <w:rFonts w:ascii="Helvetica Light" w:hAnsi="Helvetica Light" w:cs="Helvetica Light"/>
+          <w:sz w:val="24"/>
+          <w:sz-cs w:val="24"/>
+        </w:rPr>
+        <w:t xml:space="preserve">## 23. End-to-End Operational Flow (Updated)</w:t>
+      </w:r>
+    </w:p>
+    <w:p>
+      <w:pPr/>
+      <w:r>
+        <w:rPr>
+          <w:rFonts w:ascii="Helvetica Light" w:hAnsi="Helvetica Light" w:cs="Helvetica Light"/>
+          <w:sz w:val="24"/>
+          <w:sz-cs w:val="24"/>
+        </w:rPr>
+        <w:t xml:space="preserve"/>
+      </w:r>
+    </w:p>
+    <w:p>
+      <w:pPr/>
+      <w:r>
+        <w:rPr>
+          <w:rFonts w:ascii="Helvetica Light" w:hAnsi="Helvetica Light" w:cs="Helvetica Light"/>
+          <w:sz w:val="24"/>
+          <w:sz-cs w:val="24"/>
+        </w:rPr>
+        <w:t xml:space="preserve">This section defines the practical user flow across the current implementation, from secure entry to reporting and backup.</w:t>
+      </w:r>
+    </w:p>
+    <w:p>
+      <w:pPr/>
+      <w:r>
+        <w:rPr>
+          <w:rFonts w:ascii="Helvetica Light" w:hAnsi="Helvetica Light" w:cs="Helvetica Light"/>
+          <w:sz w:val="24"/>
+          <w:sz-cs w:val="24"/>
+        </w:rPr>
+        <w:t xml:space="preserve"/>
+      </w:r>
+    </w:p>
+    <w:p>
+      <w:pPr/>
+      <w:r>
+        <w:rPr>
+          <w:rFonts w:ascii="Helvetica Light" w:hAnsi="Helvetica Light" w:cs="Helvetica Light"/>
+          <w:sz w:val="24"/>
+          <w:sz-cs w:val="24"/>
+        </w:rPr>
+        <w:t xml:space="preserve">### 23.1 Flow A: Secure Entry and Session Start</w:t>
+      </w:r>
+    </w:p>
+    <w:p>
+      <w:pPr/>
+      <w:r>
+        <w:rPr>
+          <w:rFonts w:ascii="Helvetica Light" w:hAnsi="Helvetica Light" w:cs="Helvetica Light"/>
+          <w:sz w:val="24"/>
+          <w:sz-cs w:val="24"/>
+        </w:rPr>
+        <w:t xml:space="preserve"/>
+      </w:r>
+    </w:p>
+    <w:p>
+      <w:pPr/>
+      <w:r>
+        <w:rPr>
+          <w:rFonts w:ascii="Helvetica Light" w:hAnsi="Helvetica Light" w:cs="Helvetica Light"/>
+          <w:sz w:val="24"/>
+          <w:sz-cs w:val="24"/>
+        </w:rPr>
+        <w:t xml:space="preserve">1. User opens the app.</w:t>
+      </w:r>
+    </w:p>
+    <w:p>
+      <w:pPr/>
+      <w:r>
+        <w:rPr>
+          <w:rFonts w:ascii="Helvetica Light" w:hAnsi="Helvetica Light" w:cs="Helvetica Light"/>
+          <w:sz w:val="24"/>
+          <w:sz-cs w:val="24"/>
+        </w:rPr>
+        <w:t xml:space="preserve">2. App lock gate appears when lock is enabled.</w:t>
+      </w:r>
+    </w:p>
+    <w:p>
+      <w:pPr/>
+      <w:r>
+        <w:rPr>
+          <w:rFonts w:ascii="Helvetica Light" w:hAnsi="Helvetica Light" w:cs="Helvetica Light"/>
+          <w:sz w:val="24"/>
+          <w:sz-cs w:val="24"/>
+        </w:rPr>
+        <w:t xml:space="preserve">3. User unlocks with PIN or biometrics.</w:t>
+      </w:r>
+    </w:p>
+    <w:p>
+      <w:pPr/>
+      <w:r>
+        <w:rPr>
+          <w:rFonts w:ascii="Helvetica Light" w:hAnsi="Helvetica Light" w:cs="Helvetica Light"/>
+          <w:sz w:val="24"/>
+          <w:sz-cs w:val="24"/>
+        </w:rPr>
+        <w:t xml:space="preserve">4. User lands on Dashboard with current business and expense summaries.</w:t>
+      </w:r>
+    </w:p>
+    <w:p>
+      <w:pPr/>
+      <w:r>
+        <w:rPr>
+          <w:rFonts w:ascii="Helvetica Light" w:hAnsi="Helvetica Light" w:cs="Helvetica Light"/>
+          <w:sz w:val="24"/>
+          <w:sz-cs w:val="24"/>
+        </w:rPr>
+        <w:t xml:space="preserve"/>
+      </w:r>
+    </w:p>
+    <w:p>
+      <w:pPr/>
+      <w:r>
+        <w:rPr>
+          <w:rFonts w:ascii="Helvetica Light" w:hAnsi="Helvetica Light" w:cs="Helvetica Light"/>
+          <w:sz w:val="24"/>
+          <w:sz-cs w:val="24"/>
+        </w:rPr>
+        <w:t xml:space="preserve">### 23.2 Flow B: Daily Business Billing Cycle</w:t>
+      </w:r>
+    </w:p>
+    <w:p>
+      <w:pPr/>
+      <w:r>
+        <w:rPr>
+          <w:rFonts w:ascii="Helvetica Light" w:hAnsi="Helvetica Light" w:cs="Helvetica Light"/>
+          <w:sz w:val="24"/>
+          <w:sz-cs w:val="24"/>
+        </w:rPr>
+        <w:t xml:space="preserve"/>
+      </w:r>
+    </w:p>
+    <w:p>
+      <w:pPr/>
+      <w:r>
+        <w:rPr>
+          <w:rFonts w:ascii="Helvetica Light" w:hAnsi="Helvetica Light" w:cs="Helvetica Light"/>
+          <w:sz w:val="24"/>
+          <w:sz-cs w:val="24"/>
+        </w:rPr>
+        <w:t xml:space="preserve">1. User opens Business.</w:t>
+      </w:r>
+    </w:p>
+    <w:p>
+      <w:pPr/>
+      <w:r>
+        <w:rPr>
+          <w:rFonts w:ascii="Helvetica Light" w:hAnsi="Helvetica Light" w:cs="Helvetica Light"/>
+          <w:sz w:val="24"/>
+          <w:sz-cs w:val="24"/>
+        </w:rPr>
+        <w:t xml:space="preserve">2. User adds a company (if needed) and creates bill entries.</w:t>
+      </w:r>
+    </w:p>
+    <w:p>
+      <w:pPr/>
+      <w:r>
+        <w:rPr>
+          <w:rFonts w:ascii="Helvetica Light" w:hAnsi="Helvetica Light" w:cs="Helvetica Light"/>
+          <w:sz w:val="24"/>
+          <w:sz-cs w:val="24"/>
+        </w:rPr>
+        <w:t xml:space="preserve">3. User reviews table status (paid, pending, completed).</w:t>
+      </w:r>
+    </w:p>
+    <w:p>
+      <w:pPr/>
+      <w:r>
+        <w:rPr>
+          <w:rFonts w:ascii="Helvetica Light" w:hAnsi="Helvetica Light" w:cs="Helvetica Light"/>
+          <w:sz w:val="24"/>
+          <w:sz-cs w:val="24"/>
+        </w:rPr>
+        <w:t xml:space="preserve">4. User opens company detail to continue transaction handling.</w:t>
+      </w:r>
+    </w:p>
+    <w:p>
+      <w:pPr/>
+      <w:r>
+        <w:rPr>
+          <w:rFonts w:ascii="Helvetica Light" w:hAnsi="Helvetica Light" w:cs="Helvetica Light"/>
+          <w:sz w:val="24"/>
+          <w:sz-cs w:val="24"/>
+        </w:rPr>
+        <w:t xml:space="preserve"/>
+      </w:r>
+    </w:p>
+    <w:p>
+      <w:pPr/>
+      <w:r>
+        <w:rPr>
+          <w:rFonts w:ascii="Helvetica Light" w:hAnsi="Helvetica Light" w:cs="Helvetica Light"/>
+          <w:sz w:val="24"/>
+          <w:sz-cs w:val="24"/>
+        </w:rPr>
+        <w:t xml:space="preserve">### 23.3 Flow C: Company Reconciliation Loop</w:t>
+      </w:r>
+    </w:p>
+    <w:p>
+      <w:pPr/>
+      <w:r>
+        <w:rPr>
+          <w:rFonts w:ascii="Helvetica Light" w:hAnsi="Helvetica Light" w:cs="Helvetica Light"/>
+          <w:sz w:val="24"/>
+          <w:sz-cs w:val="24"/>
+        </w:rPr>
+        <w:t xml:space="preserve"/>
+      </w:r>
+    </w:p>
+    <w:p>
+      <w:pPr/>
+      <w:r>
+        <w:rPr>
+          <w:rFonts w:ascii="Helvetica Light" w:hAnsi="Helvetica Light" w:cs="Helvetica Light"/>
+          <w:sz w:val="24"/>
+          <w:sz-cs w:val="24"/>
+        </w:rPr>
+        <w:t xml:space="preserve">1. User selects a company row from Business.</w:t>
+      </w:r>
+    </w:p>
+    <w:p>
+      <w:pPr/>
+      <w:r>
+        <w:rPr>
+          <w:rFonts w:ascii="Helvetica Light" w:hAnsi="Helvetica Light" w:cs="Helvetica Light"/>
+          <w:sz w:val="24"/>
+          <w:sz-cs w:val="24"/>
+        </w:rPr>
+        <w:t xml:space="preserve">2. User adds bill-linked or direct transactions.</w:t>
+      </w:r>
+    </w:p>
+    <w:p>
+      <w:pPr/>
+      <w:r>
+        <w:rPr>
+          <w:rFonts w:ascii="Helvetica Light" w:hAnsi="Helvetica Light" w:cs="Helvetica Light"/>
+          <w:sz w:val="24"/>
+          <w:sz-cs w:val="24"/>
+        </w:rPr>
+        <w:t xml:space="preserve">3. User reviews bill-level payment history.</w:t>
+      </w:r>
+    </w:p>
+    <w:p>
+      <w:pPr/>
+      <w:r>
+        <w:rPr>
+          <w:rFonts w:ascii="Helvetica Light" w:hAnsi="Helvetica Light" w:cs="Helvetica Light"/>
+          <w:sz w:val="24"/>
+          <w:sz-cs w:val="24"/>
+        </w:rPr>
+        <w:t xml:space="preserve">4. User updates or removes incorrect payment entries.</w:t>
+      </w:r>
+    </w:p>
+    <w:p>
+      <w:pPr/>
+      <w:r>
+        <w:rPr>
+          <w:rFonts w:ascii="Helvetica Light" w:hAnsi="Helvetica Light" w:cs="Helvetica Light"/>
+          <w:sz w:val="24"/>
+          <w:sz-cs w:val="24"/>
+        </w:rPr>
+        <w:t xml:space="preserve">5. System recalculates paid and balance totals.</w:t>
+      </w:r>
+    </w:p>
+    <w:p>
+      <w:pPr/>
+      <w:r>
+        <w:rPr>
+          <w:rFonts w:ascii="Helvetica Light" w:hAnsi="Helvetica Light" w:cs="Helvetica Light"/>
+          <w:sz w:val="24"/>
+          <w:sz-cs w:val="24"/>
+        </w:rPr>
+        <w:t xml:space="preserve"/>
+      </w:r>
+    </w:p>
+    <w:p>
+      <w:pPr/>
+      <w:r>
+        <w:rPr>
+          <w:rFonts w:ascii="Helvetica Light" w:hAnsi="Helvetica Light" w:cs="Helvetica Light"/>
+          <w:sz w:val="24"/>
+          <w:sz-cs w:val="24"/>
+        </w:rPr>
+        <w:t xml:space="preserve">### 23.4 Flow D: Ledger and Document Output</w:t>
+      </w:r>
+    </w:p>
+    <w:p>
+      <w:pPr/>
+      <w:r>
+        <w:rPr>
+          <w:rFonts w:ascii="Helvetica Light" w:hAnsi="Helvetica Light" w:cs="Helvetica Light"/>
+          <w:sz w:val="24"/>
+          <w:sz-cs w:val="24"/>
+        </w:rPr>
+        <w:t xml:space="preserve"/>
+      </w:r>
+    </w:p>
+    <w:p>
+      <w:pPr/>
+      <w:r>
+        <w:rPr>
+          <w:rFonts w:ascii="Helvetica Light" w:hAnsi="Helvetica Light" w:cs="Helvetica Light"/>
+          <w:sz w:val="24"/>
+          <w:sz-cs w:val="24"/>
+        </w:rPr>
+        <w:t xml:space="preserve">1. User navigates to Ledger.</w:t>
+      </w:r>
+    </w:p>
+    <w:p>
+      <w:pPr/>
+      <w:r>
+        <w:rPr>
+          <w:rFonts w:ascii="Helvetica Light" w:hAnsi="Helvetica Light" w:cs="Helvetica Light"/>
+          <w:sz w:val="24"/>
+          <w:sz-cs w:val="24"/>
+        </w:rPr>
+        <w:t xml:space="preserve">2. User selects bill context.</w:t>
+      </w:r>
+    </w:p>
+    <w:p>
+      <w:pPr/>
+      <w:r>
+        <w:rPr>
+          <w:rFonts w:ascii="Helvetica Light" w:hAnsi="Helvetica Light" w:cs="Helvetica Light"/>
+          <w:sz w:val="24"/>
+          <w:sz-cs w:val="24"/>
+        </w:rPr>
+        <w:t xml:space="preserve">3. User verifies print layout fields (header, GST, bank details, totals).</w:t>
+      </w:r>
+    </w:p>
+    <w:p>
+      <w:pPr/>
+      <w:r>
+        <w:rPr>
+          <w:rFonts w:ascii="Helvetica Light" w:hAnsi="Helvetica Light" w:cs="Helvetica Light"/>
+          <w:sz w:val="24"/>
+          <w:sz-cs w:val="24"/>
+        </w:rPr>
+        <w:t xml:space="preserve">4. User prints statement or saves a document copy.</w:t>
+      </w:r>
+    </w:p>
+    <w:p>
+      <w:pPr/>
+      <w:r>
+        <w:rPr>
+          <w:rFonts w:ascii="Helvetica Light" w:hAnsi="Helvetica Light" w:cs="Helvetica Light"/>
+          <w:sz w:val="24"/>
+          <w:sz-cs w:val="24"/>
+        </w:rPr>
+        <w:t xml:space="preserve"/>
+      </w:r>
+    </w:p>
+    <w:p>
+      <w:pPr/>
+      <w:r>
+        <w:rPr>
+          <w:rFonts w:ascii="Helvetica Light" w:hAnsi="Helvetica Light" w:cs="Helvetica Light"/>
+          <w:sz w:val="24"/>
+          <w:sz-cs w:val="24"/>
+        </w:rPr>
+        <w:t xml:space="preserve">### 23.5 Flow E: Personal and Reporting Review</w:t>
+      </w:r>
+    </w:p>
+    <w:p>
+      <w:pPr/>
+      <w:r>
+        <w:rPr>
+          <w:rFonts w:ascii="Helvetica Light" w:hAnsi="Helvetica Light" w:cs="Helvetica Light"/>
+          <w:sz w:val="24"/>
+          <w:sz-cs w:val="24"/>
+        </w:rPr>
+        <w:t xml:space="preserve"/>
+      </w:r>
+    </w:p>
+    <w:p>
+      <w:pPr/>
+      <w:r>
+        <w:rPr>
+          <w:rFonts w:ascii="Helvetica Light" w:hAnsi="Helvetica Light" w:cs="Helvetica Light"/>
+          <w:sz w:val="24"/>
+          <w:sz-cs w:val="24"/>
+        </w:rPr>
+        <w:t xml:space="preserve">1. User opens Personal to log or review expense entries.</w:t>
+      </w:r>
+    </w:p>
+    <w:p>
+      <w:pPr/>
+      <w:r>
+        <w:rPr>
+          <w:rFonts w:ascii="Helvetica Light" w:hAnsi="Helvetica Light" w:cs="Helvetica Light"/>
+          <w:sz w:val="24"/>
+          <w:sz-cs w:val="24"/>
+        </w:rPr>
+        <w:t xml:space="preserve">2. User opens Reports for business and personal trend visibility.</w:t>
+      </w:r>
+    </w:p>
+    <w:p>
+      <w:pPr/>
+      <w:r>
+        <w:rPr>
+          <w:rFonts w:ascii="Helvetica Light" w:hAnsi="Helvetica Light" w:cs="Helvetica Light"/>
+          <w:sz w:val="24"/>
+          <w:sz-cs w:val="24"/>
+        </w:rPr>
+        <w:t xml:space="preserve">3. User uses chart plus text summaries for quick and exact interpretation.</w:t>
+      </w:r>
+    </w:p>
+    <w:p>
+      <w:pPr/>
+      <w:r>
+        <w:rPr>
+          <w:rFonts w:ascii="Helvetica Light" w:hAnsi="Helvetica Light" w:cs="Helvetica Light"/>
+          <w:sz w:val="24"/>
+          <w:sz-cs w:val="24"/>
+        </w:rPr>
+        <w:t xml:space="preserve"/>
+      </w:r>
+    </w:p>
+    <w:p>
+      <w:pPr/>
+      <w:r>
+        <w:rPr>
+          <w:rFonts w:ascii="Helvetica Light" w:hAnsi="Helvetica Light" w:cs="Helvetica Light"/>
+          <w:sz w:val="24"/>
+          <w:sz-cs w:val="24"/>
+        </w:rPr>
+        <w:t xml:space="preserve">### 23.6 Flow F: Data Protection and Recovery</w:t>
+      </w:r>
+    </w:p>
+    <w:p>
+      <w:pPr/>
+      <w:r>
+        <w:rPr>
+          <w:rFonts w:ascii="Helvetica Light" w:hAnsi="Helvetica Light" w:cs="Helvetica Light"/>
+          <w:sz w:val="24"/>
+          <w:sz-cs w:val="24"/>
+        </w:rPr>
+        <w:t xml:space="preserve"/>
+      </w:r>
+    </w:p>
+    <w:p>
+      <w:pPr/>
+      <w:r>
+        <w:rPr>
+          <w:rFonts w:ascii="Helvetica Light" w:hAnsi="Helvetica Light" w:cs="Helvetica Light"/>
+          <w:sz w:val="24"/>
+          <w:sz-cs w:val="24"/>
+        </w:rPr>
+        <w:t xml:space="preserve">1. User opens Settings.</w:t>
+      </w:r>
+    </w:p>
+    <w:p>
+      <w:pPr/>
+      <w:r>
+        <w:rPr>
+          <w:rFonts w:ascii="Helvetica Light" w:hAnsi="Helvetica Light" w:cs="Helvetica Light"/>
+          <w:sz w:val="24"/>
+          <w:sz-cs w:val="24"/>
+        </w:rPr>
+        <w:t xml:space="preserve">2. User configures fingerprint and PIN behavior.</w:t>
+      </w:r>
+    </w:p>
+    <w:p>
+      <w:pPr/>
+      <w:r>
+        <w:rPr>
+          <w:rFonts w:ascii="Helvetica Light" w:hAnsi="Helvetica Light" w:cs="Helvetica Light"/>
+          <w:sz w:val="24"/>
+          <w:sz-cs w:val="24"/>
+        </w:rPr>
+        <w:t xml:space="preserve">3. User exports encrypted backup payload.</w:t>
+      </w:r>
+    </w:p>
+    <w:p>
+      <w:pPr/>
+      <w:r>
+        <w:rPr>
+          <w:rFonts w:ascii="Helvetica Light" w:hAnsi="Helvetica Light" w:cs="Helvetica Light"/>
+          <w:sz w:val="24"/>
+          <w:sz-cs w:val="24"/>
+        </w:rPr>
+        <w:t xml:space="preserve">4. User restores backup when moving devices or recovering records.</w:t>
+      </w:r>
+    </w:p>
+    <w:p>
+      <w:pPr/>
+      <w:r>
+        <w:rPr>
+          <w:rFonts w:ascii="Helvetica Light" w:hAnsi="Helvetica Light" w:cs="Helvetica Light"/>
+          <w:sz w:val="24"/>
+          <w:sz-cs w:val="24"/>
+        </w:rPr>
+        <w:t xml:space="preserve"/>
+      </w:r>
+    </w:p>
+    <w:p>
+      <w:pPr/>
+      <w:r>
+        <w:rPr>
+          <w:rFonts w:ascii="Helvetica Light" w:hAnsi="Helvetica Light" w:cs="Helvetica Light"/>
+          <w:sz w:val="24"/>
+          <w:sz-cs w:val="24"/>
+        </w:rPr>
+        <w:t xml:space="preserve">### 23.7 Flow Quality Notes</w:t>
+      </w:r>
+    </w:p>
+    <w:p>
+      <w:pPr/>
+      <w:r>
+        <w:rPr>
+          <w:rFonts w:ascii="Helvetica Light" w:hAnsi="Helvetica Light" w:cs="Helvetica Light"/>
+          <w:sz w:val="24"/>
+          <w:sz-cs w:val="24"/>
+        </w:rPr>
+        <w:t xml:space="preserve"/>
+      </w:r>
+    </w:p>
+    <w:p>
+      <w:pPr/>
+      <w:r>
+        <w:rPr>
+          <w:rFonts w:ascii="Helvetica Light" w:hAnsi="Helvetica Light" w:cs="Helvetica Light"/>
+          <w:sz w:val="24"/>
+          <w:sz-cs w:val="24"/>
+        </w:rPr>
+        <w:t xml:space="preserve">1. The flow is intentionally short, repetitive, and predictable.</w:t>
+      </w:r>
+    </w:p>
+    <w:p>
+      <w:pPr/>
+      <w:r>
+        <w:rPr>
+          <w:rFonts w:ascii="Helvetica Light" w:hAnsi="Helvetica Light" w:cs="Helvetica Light"/>
+          <w:sz w:val="24"/>
+          <w:sz-cs w:val="24"/>
+        </w:rPr>
+        <w:t xml:space="preserve">2. Navigation continuity reduces context switching between modules.</w:t>
+      </w:r>
+    </w:p>
+    <w:p>
+      <w:pPr/>
+      <w:r>
+        <w:rPr>
+          <w:rFonts w:ascii="Helvetica Light" w:hAnsi="Helvetica Light" w:cs="Helvetica Light"/>
+          <w:sz w:val="24"/>
+          <w:sz-cs w:val="24"/>
+        </w:rPr>
+        <w:t xml:space="preserve">3. Core finance actions can be completed from mobile without changing the mental model.</w:t>
+      </w:r>
+    </w:p>
+    <w:p>
+      <w:pPr/>
+      <w:r>
+        <w:rPr>
+          <w:rFonts w:ascii="Helvetica Light" w:hAnsi="Helvetica Light" w:cs="Helvetica Light"/>
+          <w:sz w:val="24"/>
+          <w:sz-cs w:val="24"/>
+        </w:rPr>
+        <w:t xml:space="preserve">4. Print and backup are treated as primary flows, not optional extras.</w:t>
+      </w:r>
+    </w:p>
+    <w:p>
+      <w:pPr/>
+      <w:r>
+        <w:rPr>
+          <w:rFonts w:ascii="Helvetica Light" w:hAnsi="Helvetica Light" w:cs="Helvetica Light"/>
+          <w:sz w:val="24"/>
+          <w:sz-cs w:val="24"/>
+        </w:rPr>
+        <w:t xml:space="preserve"/>
+      </w:r>
+    </w:p>
+    <w:p>
+      <w:pPr/>
+      <w:r>
+        <w:rPr>
+          <w:rFonts w:ascii="Helvetica Light" w:hAnsi="Helvetica Light" w:cs="Helvetica Light"/>
+          <w:sz w:val="24"/>
+          <w:sz-cs w:val="24"/>
+        </w:rPr>
+        <w:t xml:space="preserve">### 23.8 Visual Flow Diagram: Navigation and Module Movement</w:t>
+      </w:r>
+    </w:p>
+    <w:p>
+      <w:pPr/>
+      <w:r>
+        <w:rPr>
+          <w:rFonts w:ascii="Helvetica Light" w:hAnsi="Helvetica Light" w:cs="Helvetica Light"/>
+          <w:sz w:val="24"/>
+          <w:sz-cs w:val="24"/>
+        </w:rPr>
+        <w:t xml:space="preserve"/>
+      </w:r>
+    </w:p>
+    <w:p>
+      <w:pPr/>
+      <w:r>
+        <w:rPr>
+          <w:rFonts w:ascii="Helvetica Light" w:hAnsi="Helvetica Light" w:cs="Helvetica Light"/>
+          <w:sz w:val="24"/>
+          <w:sz-cs w:val="24"/>
+        </w:rPr>
+        <w:t xml:space="preserve">```mermaid</w:t>
+      </w:r>
+    </w:p>
+    <w:p>
+      <w:pPr/>
+      <w:r>
+        <w:rPr>
+          <w:rFonts w:ascii="Helvetica Light" w:hAnsi="Helvetica Light" w:cs="Helvetica Light"/>
+          <w:sz w:val="24"/>
+          <w:sz-cs w:val="24"/>
+        </w:rPr>
+        <w:t xml:space="preserve">flowchart LR</w:t>
+      </w:r>
+    </w:p>
+    <w:p>
+      <w:pPr/>
+      <w:r>
+        <w:rPr>
+          <w:rFonts w:ascii="Helvetica Light" w:hAnsi="Helvetica Light" w:cs="Helvetica Light"/>
+          <w:sz w:val="24"/>
+          <w:sz-cs w:val="24"/>
+        </w:rPr>
+        <w:t xml:space="preserve"/>
+        <w:tab/>
+        <w:t xml:space="preserve">A[Secure Unlock] --&gt; B[Dashboard]</w:t>
+      </w:r>
+    </w:p>
+    <w:p>
+      <w:pPr/>
+      <w:r>
+        <w:rPr>
+          <w:rFonts w:ascii="Helvetica Light" w:hAnsi="Helvetica Light" w:cs="Helvetica Light"/>
+          <w:sz w:val="24"/>
+          <w:sz-cs w:val="24"/>
+        </w:rPr>
+        <w:t xml:space="preserve"/>
+        <w:tab/>
+        <w:t xml:space="preserve">B --&gt; C[Business]</w:t>
+      </w:r>
+    </w:p>
+    <w:p>
+      <w:pPr/>
+      <w:r>
+        <w:rPr>
+          <w:rFonts w:ascii="Helvetica Light" w:hAnsi="Helvetica Light" w:cs="Helvetica Light"/>
+          <w:sz w:val="24"/>
+          <w:sz-cs w:val="24"/>
+        </w:rPr>
+        <w:t xml:space="preserve"/>
+        <w:tab/>
+        <w:t xml:space="preserve">B --&gt; D[Personal]</w:t>
+      </w:r>
+    </w:p>
+    <w:p>
+      <w:pPr/>
+      <w:r>
+        <w:rPr>
+          <w:rFonts w:ascii="Helvetica Light" w:hAnsi="Helvetica Light" w:cs="Helvetica Light"/>
+          <w:sz w:val="24"/>
+          <w:sz-cs w:val="24"/>
+        </w:rPr>
+        <w:t xml:space="preserve"/>
+        <w:tab/>
+        <w:t xml:space="preserve">B --&gt; E[Reports]</w:t>
+      </w:r>
+    </w:p>
+    <w:p>
+      <w:pPr/>
+      <w:r>
+        <w:rPr>
+          <w:rFonts w:ascii="Helvetica Light" w:hAnsi="Helvetica Light" w:cs="Helvetica Light"/>
+          <w:sz w:val="24"/>
+          <w:sz-cs w:val="24"/>
+        </w:rPr>
+        <w:t xml:space="preserve"/>
+        <w:tab/>
+        <w:t xml:space="preserve">B --&gt; F[Ledger]</w:t>
+      </w:r>
+    </w:p>
+    <w:p>
+      <w:pPr/>
+      <w:r>
+        <w:rPr>
+          <w:rFonts w:ascii="Helvetica Light" w:hAnsi="Helvetica Light" w:cs="Helvetica Light"/>
+          <w:sz w:val="24"/>
+          <w:sz-cs w:val="24"/>
+        </w:rPr>
+        <w:t xml:space="preserve"/>
+        <w:tab/>
+        <w:t xml:space="preserve">B --&gt; G[Settings]</w:t>
+      </w:r>
+    </w:p>
+    <w:p>
+      <w:pPr/>
+      <w:r>
+        <w:rPr>
+          <w:rFonts w:ascii="Helvetica Light" w:hAnsi="Helvetica Light" w:cs="Helvetica Light"/>
+          <w:sz w:val="24"/>
+          <w:sz-cs w:val="24"/>
+        </w:rPr>
+        <w:t xml:space="preserve"/>
+        <w:tab/>
+        <w:t xml:space="preserve">C --&gt; H[Company Detail]</w:t>
+      </w:r>
+    </w:p>
+    <w:p>
+      <w:pPr/>
+      <w:r>
+        <w:rPr>
+          <w:rFonts w:ascii="Helvetica Light" w:hAnsi="Helvetica Light" w:cs="Helvetica Light"/>
+          <w:sz w:val="24"/>
+          <w:sz-cs w:val="24"/>
+        </w:rPr>
+        <w:t xml:space="preserve"/>
+        <w:tab/>
+        <w:t xml:space="preserve">H --&gt; I[Payments and Reconciliation]</w:t>
+      </w:r>
+    </w:p>
+    <w:p>
+      <w:pPr/>
+      <w:r>
+        <w:rPr>
+          <w:rFonts w:ascii="Helvetica Light" w:hAnsi="Helvetica Light" w:cs="Helvetica Light"/>
+          <w:sz w:val="24"/>
+          <w:sz-cs w:val="24"/>
+        </w:rPr>
+        <w:t xml:space="preserve"/>
+        <w:tab/>
+        <w:t xml:space="preserve">I --&gt; E</w:t>
+      </w:r>
+    </w:p>
+    <w:p>
+      <w:pPr/>
+      <w:r>
+        <w:rPr>
+          <w:rFonts w:ascii="Helvetica Light" w:hAnsi="Helvetica Light" w:cs="Helvetica Light"/>
+          <w:sz w:val="24"/>
+          <w:sz-cs w:val="24"/>
+        </w:rPr>
+        <w:t xml:space="preserve"/>
+        <w:tab/>
+        <w:t xml:space="preserve">I --&gt; F</w:t>
+      </w:r>
+    </w:p>
+    <w:p>
+      <w:pPr/>
+      <w:r>
+        <w:rPr>
+          <w:rFonts w:ascii="Helvetica Light" w:hAnsi="Helvetica Light" w:cs="Helvetica Light"/>
+          <w:sz w:val="24"/>
+          <w:sz-cs w:val="24"/>
+        </w:rPr>
+        <w:t xml:space="preserve"/>
+        <w:tab/>
+        <w:t xml:space="preserve">D --&gt; E</w:t>
+      </w:r>
+    </w:p>
+    <w:p>
+      <w:pPr/>
+      <w:r>
+        <w:rPr>
+          <w:rFonts w:ascii="Helvetica Light" w:hAnsi="Helvetica Light" w:cs="Helvetica Light"/>
+          <w:sz w:val="24"/>
+          <w:sz-cs w:val="24"/>
+        </w:rPr>
+        <w:t xml:space="preserve"/>
+        <w:tab/>
+        <w:t xml:space="preserve">G --&gt; J[Backup Export and Restore]</w:t>
+      </w:r>
+    </w:p>
+    <w:p>
+      <w:pPr/>
+      <w:r>
+        <w:rPr>
+          <w:rFonts w:ascii="Helvetica Light" w:hAnsi="Helvetica Light" w:cs="Helvetica Light"/>
+          <w:sz w:val="24"/>
+          <w:sz-cs w:val="24"/>
+        </w:rPr>
+        <w:t xml:space="preserve"/>
+        <w:tab/>
+        <w:t xml:space="preserve">G --&gt; K[PIN and Biometric Control]</w:t>
+      </w:r>
+    </w:p>
+    <w:p>
+      <w:pPr/>
+      <w:r>
+        <w:rPr>
+          <w:rFonts w:ascii="Helvetica Light" w:hAnsi="Helvetica Light" w:cs="Helvetica Light"/>
+          <w:sz w:val="24"/>
+          <w:sz-cs w:val="24"/>
+        </w:rPr>
+        <w:t xml:space="preserve">```</w:t>
+      </w:r>
+    </w:p>
+    <w:p>
+      <w:pPr/>
+      <w:r>
+        <w:rPr>
+          <w:rFonts w:ascii="Helvetica Light" w:hAnsi="Helvetica Light" w:cs="Helvetica Light"/>
+          <w:sz w:val="24"/>
+          <w:sz-cs w:val="24"/>
+        </w:rPr>
+        <w:t xml:space="preserve"/>
+      </w:r>
+    </w:p>
+    <w:p>
+      <w:pPr/>
+      <w:r>
+        <w:rPr>
+          <w:rFonts w:ascii="Helvetica Light" w:hAnsi="Helvetica Light" w:cs="Helvetica Light"/>
+          <w:sz w:val="24"/>
+          <w:sz-cs w:val="24"/>
+        </w:rPr>
+        <w:t xml:space="preserve">### 23.9 Visual Flow Diagram: Daily Operational Cycle</w:t>
+      </w:r>
+    </w:p>
+    <w:p>
+      <w:pPr/>
+      <w:r>
+        <w:rPr>
+          <w:rFonts w:ascii="Helvetica Light" w:hAnsi="Helvetica Light" w:cs="Helvetica Light"/>
+          <w:sz w:val="24"/>
+          <w:sz-cs w:val="24"/>
+        </w:rPr>
+        <w:t xml:space="preserve"/>
+      </w:r>
+    </w:p>
+    <w:p>
+      <w:pPr/>
+      <w:r>
+        <w:rPr>
+          <w:rFonts w:ascii="Helvetica Light" w:hAnsi="Helvetica Light" w:cs="Helvetica Light"/>
+          <w:sz w:val="24"/>
+          <w:sz-cs w:val="24"/>
+        </w:rPr>
+        <w:t xml:space="preserve">```mermaid</w:t>
+      </w:r>
+    </w:p>
+    <w:p>
+      <w:pPr/>
+      <w:r>
+        <w:rPr>
+          <w:rFonts w:ascii="Helvetica Light" w:hAnsi="Helvetica Light" w:cs="Helvetica Light"/>
+          <w:sz w:val="24"/>
+          <w:sz-cs w:val="24"/>
+        </w:rPr>
+        <w:t xml:space="preserve">flowchart TD</w:t>
+      </w:r>
+    </w:p>
+    <w:p>
+      <w:pPr/>
+      <w:r>
+        <w:rPr>
+          <w:rFonts w:ascii="Helvetica Light" w:hAnsi="Helvetica Light" w:cs="Helvetica Light"/>
+          <w:sz w:val="24"/>
+          <w:sz-cs w:val="24"/>
+        </w:rPr>
+        <w:t xml:space="preserve"/>
+        <w:tab/>
+        <w:t xml:space="preserve">S1[Start Day] --&gt; S2[Unlock App]</w:t>
+      </w:r>
+    </w:p>
+    <w:p>
+      <w:pPr/>
+      <w:r>
+        <w:rPr>
+          <w:rFonts w:ascii="Helvetica Light" w:hAnsi="Helvetica Light" w:cs="Helvetica Light"/>
+          <w:sz w:val="24"/>
+          <w:sz-cs w:val="24"/>
+        </w:rPr>
+        <w:t xml:space="preserve"/>
+        <w:tab/>
+        <w:t xml:space="preserve">S2 --&gt; S3[Open Business]</w:t>
+      </w:r>
+    </w:p>
+    <w:p>
+      <w:pPr/>
+      <w:r>
+        <w:rPr>
+          <w:rFonts w:ascii="Helvetica Light" w:hAnsi="Helvetica Light" w:cs="Helvetica Light"/>
+          <w:sz w:val="24"/>
+          <w:sz-cs w:val="24"/>
+        </w:rPr>
+        <w:t xml:space="preserve"/>
+        <w:tab/>
+        <w:t xml:space="preserve">S3 --&gt; S4[Create or Update Bill]</w:t>
+      </w:r>
+    </w:p>
+    <w:p>
+      <w:pPr/>
+      <w:r>
+        <w:rPr>
+          <w:rFonts w:ascii="Helvetica Light" w:hAnsi="Helvetica Light" w:cs="Helvetica Light"/>
+          <w:sz w:val="24"/>
+          <w:sz-cs w:val="24"/>
+        </w:rPr>
+        <w:t xml:space="preserve"/>
+        <w:tab/>
+        <w:t xml:space="preserve">S4 --&gt; S5[Collect Payment]</w:t>
+      </w:r>
+    </w:p>
+    <w:p>
+      <w:pPr/>
+      <w:r>
+        <w:rPr>
+          <w:rFonts w:ascii="Helvetica Light" w:hAnsi="Helvetica Light" w:cs="Helvetica Light"/>
+          <w:sz w:val="24"/>
+          <w:sz-cs w:val="24"/>
+        </w:rPr>
+        <w:t xml:space="preserve"/>
+        <w:tab/>
+        <w:t xml:space="preserve">S5 --&gt; S6[Recalculate Balance and Status]</w:t>
+      </w:r>
+    </w:p>
+    <w:p>
+      <w:pPr/>
+      <w:r>
+        <w:rPr>
+          <w:rFonts w:ascii="Helvetica Light" w:hAnsi="Helvetica Light" w:cs="Helvetica Light"/>
+          <w:sz w:val="24"/>
+          <w:sz-cs w:val="24"/>
+        </w:rPr>
+        <w:t xml:space="preserve"/>
+        <w:tab/>
+        <w:t xml:space="preserve">S6 --&gt; S7[Review Dashboard and Reports]</w:t>
+      </w:r>
+    </w:p>
+    <w:p>
+      <w:pPr/>
+      <w:r>
+        <w:rPr>
+          <w:rFonts w:ascii="Helvetica Light" w:hAnsi="Helvetica Light" w:cs="Helvetica Light"/>
+          <w:sz w:val="24"/>
+          <w:sz-cs w:val="24"/>
+        </w:rPr>
+        <w:t xml:space="preserve"/>
+        <w:tab/>
+        <w:t xml:space="preserve">S7 --&gt; S8[Generate Ledger Statement]</w:t>
+      </w:r>
+    </w:p>
+    <w:p>
+      <w:pPr/>
+      <w:r>
+        <w:rPr>
+          <w:rFonts w:ascii="Helvetica Light" w:hAnsi="Helvetica Light" w:cs="Helvetica Light"/>
+          <w:sz w:val="24"/>
+          <w:sz-cs w:val="24"/>
+        </w:rPr>
+        <w:t xml:space="preserve"/>
+        <w:tab/>
+        <w:t xml:space="preserve">S8 --&gt; S9[Open Settings]</w:t>
+      </w:r>
+    </w:p>
+    <w:p>
+      <w:pPr/>
+      <w:r>
+        <w:rPr>
+          <w:rFonts w:ascii="Helvetica Light" w:hAnsi="Helvetica Light" w:cs="Helvetica Light"/>
+          <w:sz w:val="24"/>
+          <w:sz-cs w:val="24"/>
+        </w:rPr>
+        <w:t xml:space="preserve"/>
+        <w:tab/>
+        <w:t xml:space="preserve">S9 --&gt; S10[Run Backup]</w:t>
+      </w:r>
+    </w:p>
+    <w:p>
+      <w:pPr/>
+      <w:r>
+        <w:rPr>
+          <w:rFonts w:ascii="Helvetica Light" w:hAnsi="Helvetica Light" w:cs="Helvetica Light"/>
+          <w:sz w:val="24"/>
+          <w:sz-cs w:val="24"/>
+        </w:rPr>
+        <w:t xml:space="preserve"/>
+        <w:tab/>
+        <w:t xml:space="preserve">S10 --&gt; S11[End Day]</w:t>
+      </w:r>
+    </w:p>
+    <w:p>
+      <w:pPr/>
+      <w:r>
+        <w:rPr>
+          <w:rFonts w:ascii="Helvetica Light" w:hAnsi="Helvetica Light" w:cs="Helvetica Light"/>
+          <w:sz w:val="24"/>
+          <w:sz-cs w:val="24"/>
+        </w:rPr>
+        <w:t xml:space="preserve">```</w:t>
       </w:r>
     </w:p>
     <w:sectPr/>

</xml_diff>